<commit_message>
POO S2 (Clases y objetos): profundizacion rigurosa (firma/sobrecarga, referencias/aliasing, NPE)
</commit_message>
<xml_diff>
--- a/02-week/optional-activity/pdf/Actividad-Semana02.docx
+++ b/02-week/optional-activity/pdf/Actividad-Semana02.docx
@@ -31,7 +31,7 @@
           <w:sz w:val="22"/>
           <w:szCs w:val="22"/>
         </w:rPr>
-        <w:t xml:space="preserve">Programación y Diseño Orientado a Objetos · Semana 2 · Modela y usa tus primeras clases</w:t>
+        <w:t xml:space="preserve">Programación y Diseño Orientado a Objetos · Semana 2 · Clases, objetos y el modelo de referencias</w:t>
       </w:r>
     </w:p>
     <w:tbl>
@@ -430,7 +430,7 @@
           <w:sz w:val="22"/>
           <w:szCs w:val="22"/>
         </w:rPr>
-        <w:t xml:space="preserve">Declarar una clase con atributos y métodos.</w:t>
+        <w:t xml:space="preserve">Declarar una clase con atributos y métodos, usando this.</w:t>
       </w:r>
     </w:p>
     <w:p>
@@ -454,7 +454,31 @@
           <w:sz w:val="22"/>
           <w:szCs w:val="22"/>
         </w:rPr>
-        <w:t xml:space="preserve">Instanciar varios objetos y usar su estado y comportamiento.</w:t>
+        <w:t xml:space="preserve">Instanciar varios objetos con estado independiente.</w:t>
+      </w:r>
+    </w:p>
+    <w:p>
+      <w:pPr>
+        <w:spacing w:after="120" w:line="276" w:lineRule="auto"/>
+        <w:ind w:left="454" w:hanging="284"/>
+      </w:pPr>
+      <w:r>
+        <w:rPr>
+          <w:rFonts w:ascii="Times New Roman" w:hAnsi="Times New Roman" w:cs="Times New Roman"/>
+          <w:color w:val="000000"/>
+          <w:sz w:val="22"/>
+          <w:szCs w:val="22"/>
+        </w:rPr>
+        <w:t xml:space="preserve">•	</w:t>
+      </w:r>
+      <w:r>
+        <w:rPr>
+          <w:rFonts w:ascii="Times New Roman" w:hAnsi="Times New Roman" w:cs="Times New Roman"/>
+          <w:color w:val="000000"/>
+          <w:sz w:val="22"/>
+          <w:szCs w:val="22"/>
+        </w:rPr>
+        <w:t xml:space="preserve">Evidenciar y explicar el aliasing de referencias.</w:t>
       </w:r>
     </w:p>
     <w:p>
@@ -497,7 +521,7 @@
           <w:sz w:val="22"/>
           <w:szCs w:val="22"/>
         </w:rPr>
-        <w:t xml:space="preserve">Crea una clase </w:t>
+        <w:t xml:space="preserve">Crea la clase </w:t>
       </w:r>
       <w:r>
         <w:rPr>
@@ -515,7 +539,7 @@
           <w:sz w:val="22"/>
           <w:szCs w:val="22"/>
         </w:rPr>
-        <w:t xml:space="preserve"> con atributos: </w:t>
+        <w:t xml:space="preserve"> con atributos </w:t>
       </w:r>
       <w:r>
         <w:rPr>
@@ -569,7 +593,7 @@
           <w:sz w:val="22"/>
           <w:szCs w:val="22"/>
         </w:rPr>
-        <w:t xml:space="preserve">.</w:t>
+        <w:t xml:space="preserve"> y métodos:</w:t>
       </w:r>
     </w:p>
     <w:p>
@@ -584,16 +608,7 @@
           <w:sz w:val="22"/>
           <w:szCs w:val="22"/>
         </w:rPr>
-        <w:t xml:space="preserve">2.	</w:t>
-      </w:r>
-      <w:r>
-        <w:rPr>
-          <w:rFonts w:ascii="Times New Roman" w:hAnsi="Times New Roman" w:cs="Times New Roman"/>
-          <w:color w:val="000000"/>
-          <w:sz w:val="22"/>
-          <w:szCs w:val="22"/>
-        </w:rPr>
-        <w:t xml:space="preserve">Agrega un método </w:t>
+        <w:t xml:space="preserve">•	</w:t>
       </w:r>
       <w:r>
         <w:rPr>
@@ -611,7 +626,7 @@
           <w:sz w:val="22"/>
           <w:szCs w:val="22"/>
         </w:rPr>
-        <w:t xml:space="preserve"> que imprima los datos del libro.</w:t>
+        <w:t xml:space="preserve"> — imprime los datos.</w:t>
       </w:r>
     </w:p>
     <w:p>
@@ -626,16 +641,7 @@
           <w:sz w:val="22"/>
           <w:szCs w:val="22"/>
         </w:rPr>
-        <w:t xml:space="preserve">3.	</w:t>
-      </w:r>
-      <w:r>
-        <w:rPr>
-          <w:rFonts w:ascii="Times New Roman" w:hAnsi="Times New Roman" w:cs="Times New Roman"/>
-          <w:color w:val="000000"/>
-          <w:sz w:val="22"/>
-          <w:szCs w:val="22"/>
-        </w:rPr>
-        <w:t xml:space="preserve">Agrega un método </w:t>
+        <w:t xml:space="preserve">•	</w:t>
       </w:r>
       <w:r>
         <w:rPr>
@@ -653,7 +659,7 @@
           <w:sz w:val="22"/>
           <w:szCs w:val="22"/>
         </w:rPr>
-        <w:t xml:space="preserve"> que devuelva </w:t>
+        <w:t xml:space="preserve"> — devuelve </w:t>
       </w:r>
       <w:r>
         <w:rPr>
@@ -671,7 +677,25 @@
           <w:sz w:val="22"/>
           <w:szCs w:val="22"/>
         </w:rPr>
-        <w:t xml:space="preserve"> si tiene más de 300 páginas.</w:t>
+        <w:t xml:space="preserve"> si </w:t>
+      </w:r>
+      <w:r>
+        <w:rPr>
+          <w:rFonts w:ascii="Consolas" w:hAnsi="Consolas" w:cs="Consolas"/>
+          <w:color w:val="000000"/>
+          <w:sz w:val="22"/>
+          <w:szCs w:val="22"/>
+        </w:rPr>
+        <w:t xml:space="preserve">paginas &gt; 300</w:t>
+      </w:r>
+      <w:r>
+        <w:rPr>
+          <w:rFonts w:ascii="Times New Roman" w:hAnsi="Times New Roman" w:cs="Times New Roman"/>
+          <w:color w:val="000000"/>
+          <w:sz w:val="22"/>
+          <w:szCs w:val="22"/>
+        </w:rPr>
+        <w:t xml:space="preserve">.</w:t>
       </w:r>
     </w:p>
     <w:p>
@@ -686,7 +710,7 @@
           <w:sz w:val="22"/>
           <w:szCs w:val="22"/>
         </w:rPr>
-        <w:t xml:space="preserve">4.	</w:t>
+        <w:t xml:space="preserve">1.	</w:t>
       </w:r>
       <w:r>
         <w:rPr>
@@ -704,7 +728,7 @@
           <w:sz w:val="22"/>
           <w:szCs w:val="22"/>
         </w:rPr>
-        <w:t xml:space="preserve">main</w:t>
+        <w:t xml:space="preserve">Main</w:t>
       </w:r>
       <w:r>
         <w:rPr>
@@ -723,16 +747,202 @@
           <w:sz w:val="22"/>
           <w:szCs w:val="22"/>
         </w:rPr>
-        <w:t xml:space="preserve">3 libros</w:t>
-      </w:r>
-      <w:r>
-        <w:rPr>
-          <w:rFonts w:ascii="Times New Roman" w:hAnsi="Times New Roman" w:cs="Times New Roman"/>
-          <w:color w:val="000000"/>
-          <w:sz w:val="22"/>
-          <w:szCs w:val="22"/>
-        </w:rPr>
-        <w:t xml:space="preserve"> distintos, descríbelos e indica cuáles son largos.</w:t>
+        <w:t xml:space="preserve">tres</w:t>
+      </w:r>
+      <w:r>
+        <w:rPr>
+          <w:rFonts w:ascii="Times New Roman" w:hAnsi="Times New Roman" w:cs="Times New Roman"/>
+          <w:color w:val="000000"/>
+          <w:sz w:val="22"/>
+          <w:szCs w:val="22"/>
+        </w:rPr>
+        <w:t xml:space="preserve"> libros distintos, descríbelos e indica cuáles son largos (evidencia el estado independiente de cada objeto).</w:t>
+      </w:r>
+    </w:p>
+    <w:p>
+      <w:pPr>
+        <w:spacing w:after="120" w:line="276" w:lineRule="auto"/>
+        <w:ind w:left="454" w:hanging="284"/>
+      </w:pPr>
+      <w:r>
+        <w:rPr>
+          <w:rFonts w:ascii="Times New Roman" w:hAnsi="Times New Roman" w:cs="Times New Roman"/>
+          <w:color w:val="000000"/>
+          <w:sz w:val="22"/>
+          <w:szCs w:val="22"/>
+        </w:rPr>
+        <w:t xml:space="preserve">2.	</w:t>
+      </w:r>
+      <w:r>
+        <w:rPr>
+          <w:rFonts w:ascii="Times New Roman" w:hAnsi="Times New Roman" w:cs="Times New Roman"/>
+          <w:b/>
+          <w:color w:val="000000"/>
+          <w:sz w:val="22"/>
+          <w:szCs w:val="22"/>
+        </w:rPr>
+        <w:t xml:space="preserve">Demostración de aliasing:</w:t>
+      </w:r>
+      <w:r>
+        <w:rPr>
+          <w:rFonts w:ascii="Times New Roman" w:hAnsi="Times New Roman" w:cs="Times New Roman"/>
+          <w:color w:val="000000"/>
+          <w:sz w:val="22"/>
+          <w:szCs w:val="22"/>
+        </w:rPr>
+        <w:t xml:space="preserve"> asigna uno de los libros a una segunda variable (</w:t>
+      </w:r>
+      <w:r>
+        <w:rPr>
+          <w:rFonts w:ascii="Consolas" w:hAnsi="Consolas" w:cs="Consolas"/>
+          <w:color w:val="000000"/>
+          <w:sz w:val="22"/>
+          <w:szCs w:val="22"/>
+        </w:rPr>
+        <w:t xml:space="preserve">Libro otro = libro1;</w:t>
+      </w:r>
+      <w:r>
+        <w:rPr>
+          <w:rFonts w:ascii="Times New Roman" w:hAnsi="Times New Roman" w:cs="Times New Roman"/>
+          <w:color w:val="000000"/>
+          <w:sz w:val="22"/>
+          <w:szCs w:val="22"/>
+        </w:rPr>
+        <w:t xml:space="preserve">), modifica el título </w:t>
+      </w:r>
+      <w:r>
+        <w:rPr>
+          <w:rFonts w:ascii="Times New Roman" w:hAnsi="Times New Roman" w:cs="Times New Roman"/>
+          <w:b/>
+          <w:color w:val="000000"/>
+          <w:sz w:val="22"/>
+          <w:szCs w:val="22"/>
+        </w:rPr>
+        <w:t xml:space="preserve">por la segunda variable</w:t>
+      </w:r>
+      <w:r>
+        <w:rPr>
+          <w:rFonts w:ascii="Times New Roman" w:hAnsi="Times New Roman" w:cs="Times New Roman"/>
+          <w:color w:val="000000"/>
+          <w:sz w:val="22"/>
+          <w:szCs w:val="22"/>
+        </w:rPr>
+        <w:t xml:space="preserve"> y muestra que el primero "ve" el cambio. Explica en el README </w:t>
+      </w:r>
+      <w:r>
+        <w:rPr>
+          <w:rFonts w:ascii="Times New Roman" w:hAnsi="Times New Roman" w:cs="Times New Roman"/>
+          <w:b/>
+          <w:color w:val="000000"/>
+          <w:sz w:val="22"/>
+          <w:szCs w:val="22"/>
+        </w:rPr>
+        <w:t xml:space="preserve">por qué</w:t>
+      </w:r>
+      <w:r>
+        <w:rPr>
+          <w:rFonts w:ascii="Times New Roman" w:hAnsi="Times New Roman" w:cs="Times New Roman"/>
+          <w:color w:val="000000"/>
+          <w:sz w:val="22"/>
+          <w:szCs w:val="22"/>
+        </w:rPr>
+        <w:t xml:space="preserve"> ocurre.</w:t>
+      </w:r>
+    </w:p>
+    <w:p>
+      <w:pPr>
+        <w:spacing w:after="120" w:line="276" w:lineRule="auto"/>
+        <w:ind w:left="454" w:hanging="284"/>
+      </w:pPr>
+      <w:r>
+        <w:rPr>
+          <w:rFonts w:ascii="Times New Roman" w:hAnsi="Times New Roman" w:cs="Times New Roman"/>
+          <w:color w:val="000000"/>
+          <w:sz w:val="22"/>
+          <w:szCs w:val="22"/>
+        </w:rPr>
+        <w:t xml:space="preserve">3.	</w:t>
+      </w:r>
+      <w:r>
+        <w:rPr>
+          <w:rFonts w:ascii="Times New Roman" w:hAnsi="Times New Roman" w:cs="Times New Roman"/>
+          <w:color w:val="000000"/>
+          <w:sz w:val="22"/>
+          <w:szCs w:val="22"/>
+        </w:rPr>
+        <w:t xml:space="preserve">Provoca (y luego previene con </w:t>
+      </w:r>
+      <w:r>
+        <w:rPr>
+          <w:rFonts w:ascii="Consolas" w:hAnsi="Consolas" w:cs="Consolas"/>
+          <w:color w:val="000000"/>
+          <w:sz w:val="22"/>
+          <w:szCs w:val="22"/>
+        </w:rPr>
+        <w:t xml:space="preserve">if != null</w:t>
+      </w:r>
+      <w:r>
+        <w:rPr>
+          <w:rFonts w:ascii="Times New Roman" w:hAnsi="Times New Roman" w:cs="Times New Roman"/>
+          <w:color w:val="000000"/>
+          <w:sz w:val="22"/>
+          <w:szCs w:val="22"/>
+        </w:rPr>
+        <w:t xml:space="preserve">) un </w:t>
+      </w:r>
+      <w:r>
+        <w:rPr>
+          <w:rFonts w:ascii="Consolas" w:hAnsi="Consolas" w:cs="Consolas"/>
+          <w:color w:val="000000"/>
+          <w:sz w:val="22"/>
+          <w:szCs w:val="22"/>
+        </w:rPr>
+        <w:t xml:space="preserve">NullPointerException</w:t>
+      </w:r>
+      <w:r>
+        <w:rPr>
+          <w:rFonts w:ascii="Times New Roman" w:hAnsi="Times New Roman" w:cs="Times New Roman"/>
+          <w:color w:val="000000"/>
+          <w:sz w:val="22"/>
+          <w:szCs w:val="22"/>
+        </w:rPr>
+        <w:t xml:space="preserve"> con una referencia </w:t>
+      </w:r>
+      <w:r>
+        <w:rPr>
+          <w:rFonts w:ascii="Consolas" w:hAnsi="Consolas" w:cs="Consolas"/>
+          <w:color w:val="000000"/>
+          <w:sz w:val="22"/>
+          <w:szCs w:val="22"/>
+        </w:rPr>
+        <w:t xml:space="preserve">Libro</w:t>
+      </w:r>
+      <w:r>
+        <w:rPr>
+          <w:rFonts w:ascii="Times New Roman" w:hAnsi="Times New Roman" w:cs="Times New Roman"/>
+          <w:color w:val="000000"/>
+          <w:sz w:val="22"/>
+          <w:szCs w:val="22"/>
+        </w:rPr>
+        <w:t xml:space="preserve"> en </w:t>
+      </w:r>
+      <w:r>
+        <w:rPr>
+          <w:rFonts w:ascii="Consolas" w:hAnsi="Consolas" w:cs="Consolas"/>
+          <w:color w:val="000000"/>
+          <w:sz w:val="22"/>
+          <w:szCs w:val="22"/>
+        </w:rPr>
+        <w:t xml:space="preserve">null</w:t>
+      </w:r>
+      <w:r>
+        <w:rPr>
+          <w:rFonts w:ascii="Times New Roman" w:hAnsi="Times New Roman" w:cs="Times New Roman"/>
+          <w:color w:val="000000"/>
+          <w:sz w:val="22"/>
+          <w:szCs w:val="22"/>
+        </w:rPr>
+        <w:t xml:space="preserve">. Documenta ambos casos.</w:t>
       </w:r>
     </w:p>
     <w:p>
@@ -775,7 +985,25 @@
           <w:sz w:val="22"/>
           <w:szCs w:val="22"/>
         </w:rPr>
-        <w:t xml:space="preserve">Clase con atributos y 2 métodos.</w:t>
+        <w:t xml:space="preserve">Uso correcto de </w:t>
+      </w:r>
+      <w:r>
+        <w:rPr>
+          <w:rFonts w:ascii="Consolas" w:hAnsi="Consolas" w:cs="Consolas"/>
+          <w:color w:val="000000"/>
+          <w:sz w:val="22"/>
+          <w:szCs w:val="22"/>
+        </w:rPr>
+        <w:t xml:space="preserve">this</w:t>
+      </w:r>
+      <w:r>
+        <w:rPr>
+          <w:rFonts w:ascii="Times New Roman" w:hAnsi="Times New Roman" w:cs="Times New Roman"/>
+          <w:color w:val="000000"/>
+          <w:sz w:val="22"/>
+          <w:szCs w:val="22"/>
+        </w:rPr>
+        <w:t xml:space="preserve"> y de convenciones de nombres.</w:t>
       </w:r>
     </w:p>
     <w:p>
@@ -799,7 +1027,7 @@
           <w:sz w:val="22"/>
           <w:szCs w:val="22"/>
         </w:rPr>
-        <w:t xml:space="preserve">Al menos 3 objetos instanciados.</w:t>
+        <w:t xml:space="preserve">Tres objetos con estado propio.</w:t>
       </w:r>
     </w:p>
     <w:p>
@@ -823,7 +1051,31 @@
           <w:sz w:val="22"/>
           <w:szCs w:val="22"/>
         </w:rPr>
-        <w:t xml:space="preserve">Uso correcto de </w:t>
+        <w:t xml:space="preserve">Aliasing demostrado y explicado.</w:t>
+      </w:r>
+    </w:p>
+    <w:p>
+      <w:pPr>
+        <w:spacing w:after="120" w:line="276" w:lineRule="auto"/>
+        <w:ind w:left="454" w:hanging="284"/>
+      </w:pPr>
+      <w:r>
+        <w:rPr>
+          <w:rFonts w:ascii="Times New Roman" w:hAnsi="Times New Roman" w:cs="Times New Roman"/>
+          <w:color w:val="000000"/>
+          <w:sz w:val="22"/>
+          <w:szCs w:val="22"/>
+        </w:rPr>
+        <w:t xml:space="preserve">•	</w:t>
+      </w:r>
+      <w:r>
+        <w:rPr>
+          <w:rFonts w:ascii="Times New Roman" w:hAnsi="Times New Roman" w:cs="Times New Roman"/>
+          <w:color w:val="000000"/>
+          <w:sz w:val="22"/>
+          <w:szCs w:val="22"/>
+        </w:rPr>
+        <w:t xml:space="preserve">Manejo del caso </w:t>
       </w:r>
       <w:r>
         <w:rPr>
@@ -832,16 +1084,16 @@
           <w:sz w:val="22"/>
           <w:szCs w:val="22"/>
         </w:rPr>
-        <w:t xml:space="preserve">new</w:t>
-      </w:r>
-      <w:r>
-        <w:rPr>
-          <w:rFonts w:ascii="Times New Roman" w:hAnsi="Times New Roman" w:cs="Times New Roman"/>
-          <w:color w:val="000000"/>
-          <w:sz w:val="22"/>
-          <w:szCs w:val="22"/>
-        </w:rPr>
-        <w:t xml:space="preserve"> y del operador punto.</w:t>
+        <w:t xml:space="preserve">null</w:t>
+      </w:r>
+      <w:r>
+        <w:rPr>
+          <w:rFonts w:ascii="Times New Roman" w:hAnsi="Times New Roman" w:cs="Times New Roman"/>
+          <w:color w:val="000000"/>
+          <w:sz w:val="22"/>
+          <w:szCs w:val="22"/>
+        </w:rPr>
+        <w:t xml:space="preserve">.</w:t>
       </w:r>
     </w:p>
     <w:p>
@@ -944,7 +1196,7 @@
           <w:sz w:val="18"/>
           <w:szCs w:val="18"/>
         </w:rPr>
-        <w:t xml:space="preserve">  README.md   -&gt; como ejecutar + salida de ejemplo</w:t>
+        <w:t xml:space="preserve">  README.md   -&gt; salida + explicacion del aliasing y del null</w:t>
       </w:r>
     </w:p>
     <w:p>
@@ -984,7 +1236,7 @@
           <w:sz w:val="22"/>
           <w:szCs w:val="22"/>
         </w:rPr>
-        <w:t xml:space="preserve">Crea el repo público con ese nombre.</w:t>
+        <w:t xml:space="preserve">Crea el repositorio público con ese nombre.</w:t>
       </w:r>
     </w:p>
     <w:p>
@@ -1032,7 +1284,7 @@
           <w:sz w:val="22"/>
           <w:szCs w:val="22"/>
         </w:rPr>
-        <w:t xml:space="preserve">Comparte el enlace por el canal indicado.</w:t>
+        <w:t xml:space="preserve">Comparte el enlace por el canal indicado por el docente.</w:t>
       </w:r>
     </w:p>
     <w:p>
@@ -1115,7 +1367,7 @@
                 <w:sz w:val="20"/>
                 <w:szCs w:val="20"/>
               </w:rPr>
-              <w:t xml:space="preserve">Excelente</w:t>
+              <w:t xml:space="preserve">Excelente (100%)</w:t>
             </w:r>
           </w:p>
         </w:tc>
@@ -1137,7 +1389,7 @@
                 <w:sz w:val="20"/>
                 <w:szCs w:val="20"/>
               </w:rPr>
-              <w:t xml:space="preserve">Aceptable</w:t>
+              <w:t xml:space="preserve">Aceptable (60%)</w:t>
             </w:r>
           </w:p>
         </w:tc>
@@ -1159,7 +1411,7 @@
                 <w:sz w:val="20"/>
                 <w:szCs w:val="20"/>
               </w:rPr>
-              <w:t xml:space="preserve">Por mejorar</w:t>
+              <w:t xml:space="preserve">Por mejorar (0%)</w:t>
             </w:r>
           </w:p>
         </w:tc>
@@ -1203,7 +1455,7 @@
                 <w:sz w:val="20"/>
                 <w:szCs w:val="20"/>
               </w:rPr>
-              <w:t xml:space="preserve">Clase Libro (atributos + métodos)</w:t>
+              <w:t xml:space="preserve">Clase Libro (atributos, métodos, this)</w:t>
             </w:r>
           </w:p>
         </w:tc>
@@ -1223,7 +1475,7 @@
                 <w:sz w:val="20"/>
                 <w:szCs w:val="20"/>
               </w:rPr>
-              <w:t xml:space="preserve">Correcta</w:t>
+              <w:t xml:space="preserve">Correcta y clara</w:t>
             </w:r>
           </w:p>
         </w:tc>
@@ -1283,7 +1535,7 @@
                 <w:sz w:val="20"/>
                 <w:szCs w:val="20"/>
               </w:rPr>
-              <w:t xml:space="preserve">35</w:t>
+              <w:t xml:space="preserve">25</w:t>
             </w:r>
           </w:p>
         </w:tc>
@@ -1305,7 +1557,7 @@
                 <w:sz w:val="20"/>
                 <w:szCs w:val="20"/>
               </w:rPr>
-              <w:t xml:space="preserve">3 objetos instanciados y usados</w:t>
+              <w:t xml:space="preserve">Tres objetos con estado propio</w:t>
             </w:r>
           </w:p>
         </w:tc>
@@ -1325,7 +1577,7 @@
                 <w:sz w:val="20"/>
                 <w:szCs w:val="20"/>
               </w:rPr>
-              <w:t xml:space="preserve">Correcto</w:t>
+              <w:t xml:space="preserve">Correcto y evidenciado</w:t>
             </w:r>
           </w:p>
         </w:tc>
@@ -1385,7 +1637,7 @@
                 <w:sz w:val="20"/>
                 <w:szCs w:val="20"/>
               </w:rPr>
-              <w:t xml:space="preserve">30</w:t>
+              <w:t xml:space="preserve">20</w:t>
             </w:r>
           </w:p>
         </w:tc>
@@ -1407,7 +1659,7 @@
                 <w:sz w:val="20"/>
                 <w:szCs w:val="20"/>
               </w:rPr>
-              <w:t xml:space="preserve">Método esLargo()</w:t>
+              <w:t xml:space="preserve">Aliasing demostrado y explicado</w:t>
             </w:r>
           </w:p>
         </w:tc>
@@ -1427,7 +1679,7 @@
                 <w:sz w:val="20"/>
                 <w:szCs w:val="20"/>
               </w:rPr>
-              <w:t xml:space="preserve">Correcto</w:t>
+              <w:t xml:space="preserve">Claro y correcto</w:t>
             </w:r>
           </w:p>
         </w:tc>
@@ -1447,7 +1699,7 @@
                 <w:sz w:val="20"/>
                 <w:szCs w:val="20"/>
               </w:rPr>
-              <w:t xml:space="preserve">Con detalles</w:t>
+              <w:t xml:space="preserve">Parcial</w:t>
             </w:r>
           </w:p>
         </w:tc>
@@ -1487,7 +1739,7 @@
                 <w:sz w:val="20"/>
                 <w:szCs w:val="20"/>
               </w:rPr>
-              <w:t xml:space="preserve">20</w:t>
+              <w:t xml:space="preserve">30</w:t>
             </w:r>
           </w:p>
         </w:tc>
@@ -1509,6 +1761,108 @@
                 <w:sz w:val="20"/>
                 <w:szCs w:val="20"/>
               </w:rPr>
+              <w:t xml:space="preserve">Manejo de null (provocar + prevenir)</w:t>
+            </w:r>
+          </w:p>
+        </w:tc>
+        <w:tc>
+          <w:tcPr>
+            <w:tcW w:w="0" w:type="auto"/>
+            <w:vAlign w:val="center"/>
+          </w:tcPr>
+          <w:p>
+            <w:pPr>
+              <w:spacing w:after="20" w:before="20"/>
+            </w:pPr>
+            <w:r>
+              <w:rPr>
+                <w:rFonts w:ascii="Times New Roman" w:hAnsi="Times New Roman" w:cs="Times New Roman"/>
+                <w:color w:val="000000"/>
+                <w:sz w:val="20"/>
+                <w:szCs w:val="20"/>
+              </w:rPr>
+              <w:t xml:space="preserve">Ambos casos</w:t>
+            </w:r>
+          </w:p>
+        </w:tc>
+        <w:tc>
+          <w:tcPr>
+            <w:tcW w:w="0" w:type="auto"/>
+            <w:vAlign w:val="center"/>
+          </w:tcPr>
+          <w:p>
+            <w:pPr>
+              <w:spacing w:after="20" w:before="20"/>
+            </w:pPr>
+            <w:r>
+              <w:rPr>
+                <w:rFonts w:ascii="Times New Roman" w:hAnsi="Times New Roman" w:cs="Times New Roman"/>
+                <w:color w:val="000000"/>
+                <w:sz w:val="20"/>
+                <w:szCs w:val="20"/>
+              </w:rPr>
+              <w:t xml:space="preserve">Uno</w:t>
+            </w:r>
+          </w:p>
+        </w:tc>
+        <w:tc>
+          <w:tcPr>
+            <w:tcW w:w="0" w:type="auto"/>
+            <w:vAlign w:val="center"/>
+          </w:tcPr>
+          <w:p>
+            <w:pPr>
+              <w:spacing w:after="20" w:before="20"/>
+            </w:pPr>
+            <w:r>
+              <w:rPr>
+                <w:rFonts w:ascii="Times New Roman" w:hAnsi="Times New Roman" w:cs="Times New Roman"/>
+                <w:color w:val="000000"/>
+                <w:sz w:val="20"/>
+                <w:szCs w:val="20"/>
+              </w:rPr>
+              <w:t xml:space="preserve">Ausente</w:t>
+            </w:r>
+          </w:p>
+        </w:tc>
+        <w:tc>
+          <w:tcPr>
+            <w:tcW w:w="0" w:type="auto"/>
+            <w:vAlign w:val="center"/>
+          </w:tcPr>
+          <w:p>
+            <w:pPr>
+              <w:spacing w:after="20" w:before="20"/>
+            </w:pPr>
+            <w:r>
+              <w:rPr>
+                <w:rFonts w:ascii="Times New Roman" w:hAnsi="Times New Roman" w:cs="Times New Roman"/>
+                <w:color w:val="000000"/>
+                <w:sz w:val="20"/>
+                <w:szCs w:val="20"/>
+              </w:rPr>
+              <w:t xml:space="preserve">15</w:t>
+            </w:r>
+          </w:p>
+        </w:tc>
+      </w:tr>
+      <w:tr>
+        <w:tc>
+          <w:tcPr>
+            <w:tcW w:w="0" w:type="auto"/>
+            <w:vAlign w:val="center"/>
+          </w:tcPr>
+          <w:p>
+            <w:pPr>
+              <w:spacing w:after="20" w:before="20"/>
+            </w:pPr>
+            <w:r>
+              <w:rPr>
+                <w:rFonts w:ascii="Times New Roman" w:hAnsi="Times New Roman" w:cs="Times New Roman"/>
+                <w:color w:val="000000"/>
+                <w:sz w:val="20"/>
+                <w:szCs w:val="20"/>
+              </w:rPr>
               <w:t xml:space="preserve">README y repositorio</w:t>
             </w:r>
           </w:p>
@@ -1589,7 +1943,7 @@
                 <w:sz w:val="20"/>
                 <w:szCs w:val="20"/>
               </w:rPr>
-              <w:t xml:space="preserve">15</w:t>
+              <w:t xml:space="preserve">10</w:t>
             </w:r>
           </w:p>
         </w:tc>
@@ -1608,7 +1962,7 @@
           <w:sz w:val="21"/>
           <w:szCs w:val="21"/>
         </w:rPr>
-        <w:t xml:space="preserve">Nota: actividad formativa y opcional (sin nota en Moodle). La guía unificada de entrega estará en el Manual de Entrega de Actividades Opcionales (próximamente).</w:t>
+        <w:t xml:space="preserve">Nota: actividad formativa y opcional (sin nota en Moodle). La guía unificada para entregar todas las actividades opcionales, válida para todas las materias, estará en el Manual de Entrega de Actividades Opcionales (próximamente).</w:t>
       </w:r>
     </w:p>
     <w:sectPr>

</xml_diff>